<commit_message>
generar json para examen - disminucion de cabecera
</commit_message>
<xml_diff>
--- a/backend/json_generation/preguntas.docx
+++ b/backend/json_generation/preguntas.docx
@@ -32,14 +32,6 @@
         <w:t>Tester</w:t>
       </w:r>
       <w:proofErr w:type="spellEnd"/>
-      <w:r>
-        <w:br/>
-        <w:t>CHAPTER: 1</w:t>
-      </w:r>
-      <w:r>
-        <w:br/>
-        <w:t>SECTION: 1.1.1</w:t>
-      </w:r>
       <w:r>
         <w:br/>
         <w:t xml:space="preserve">LEARNING_OBJECTIVE: </w:t>
@@ -1793,20 +1785,6 @@
       <w:proofErr w:type="spellEnd"/>
       <w:r>
         <w:br/>
-        <w:t>CHAPTER: 1</w:t>
-      </w:r>
-      <w:r>
-        <w:br/>
-        <w:t>SECTION: 1.</w:t>
-      </w:r>
-      <w:r>
-        <w:t>2</w:t>
-      </w:r>
-      <w:r>
-        <w:t>.1</w:t>
-      </w:r>
-      <w:r>
-        <w:br/>
         <w:t xml:space="preserve">LEARNING_OBJECTIVE: </w:t>
       </w:r>
       <w:r>
@@ -4123,7 +4101,6 @@
         <w:spacing w:before="0" w:beforeAutospacing="0" w:after="0" w:afterAutospacing="0"/>
       </w:pPr>
       <w:r>
-        <w:lastRenderedPageBreak/>
         <w:t>=== QUESTION END ===</w:t>
       </w:r>
     </w:p>
@@ -4172,29 +4149,6 @@
       <w:proofErr w:type="spellEnd"/>
       <w:r>
         <w:br/>
-        <w:t xml:space="preserve">CHAPTER: </w:t>
-      </w:r>
-      <w:r>
-        <w:t>2</w:t>
-      </w:r>
-      <w:r>
-        <w:br/>
-        <w:t xml:space="preserve">SECTION: </w:t>
-      </w:r>
-      <w:r>
-        <w:t>2</w:t>
-      </w:r>
-      <w:r>
-        <w:t>.</w:t>
-      </w:r>
-      <w:r>
-        <w:t>2</w:t>
-      </w:r>
-      <w:r>
-        <w:t>.1</w:t>
-      </w:r>
-      <w:r>
-        <w:br/>
         <w:t xml:space="preserve">LEARNING_OBJECTIVE: </w:t>
       </w:r>
       <w:r>
@@ -4323,33 +4277,15 @@
           <w:sz w:val="20"/>
           <w:szCs w:val="20"/>
         </w:rPr>
-        <w:t>1</w:t>
-      </w:r>
-      <w:proofErr w:type="gramStart"/>
-      <w:r>
-        <w:rPr>
-          <w:rFonts w:ascii="Arial" w:hAnsi="Arial" w:cs="Arial"/>
-          <w:sz w:val="20"/>
-          <w:szCs w:val="20"/>
-        </w:rPr>
-        <w:t>|</w:t>
-      </w:r>
-      <w:r>
-        <w:rPr>
-          <w:rFonts w:ascii="Arial" w:hAnsi="Arial" w:cs="Arial"/>
-          <w:sz w:val="20"/>
-          <w:szCs w:val="20"/>
-        </w:rPr>
-        <w:t>¿</w:t>
-      </w:r>
-      <w:proofErr w:type="gramEnd"/>
-      <w:r>
-        <w:rPr>
-          <w:rFonts w:ascii="Arial" w:hAnsi="Arial" w:cs="Arial"/>
-          <w:sz w:val="20"/>
-          <w:szCs w:val="20"/>
-        </w:rPr>
-        <w:t>Es importante que el enfoque de automatización de pruebas admita las pruebas de componentes?</w:t>
+        <w:t>1|</w:t>
+      </w:r>
+      <w:r>
+        <w:rPr>
+          <w:rFonts w:ascii="Arial" w:hAnsi="Arial" w:cs="Arial"/>
+          <w:sz w:val="20"/>
+          <w:szCs w:val="20"/>
+        </w:rPr>
+        <w:t>¿Es importante que el enfoque de automatización de pruebas admita las pruebas de componentes?</w:t>
       </w:r>
     </w:p>
     <w:p>
@@ -4367,33 +4303,15 @@
           <w:sz w:val="20"/>
           <w:szCs w:val="20"/>
         </w:rPr>
-        <w:t>2</w:t>
-      </w:r>
-      <w:proofErr w:type="gramStart"/>
-      <w:r>
-        <w:rPr>
-          <w:rFonts w:ascii="Arial" w:hAnsi="Arial" w:cs="Arial"/>
-          <w:sz w:val="20"/>
-          <w:szCs w:val="20"/>
-        </w:rPr>
-        <w:t>|</w:t>
-      </w:r>
-      <w:r>
-        <w:rPr>
-          <w:rFonts w:ascii="Arial" w:hAnsi="Arial" w:cs="Arial"/>
-          <w:sz w:val="20"/>
-          <w:szCs w:val="20"/>
-        </w:rPr>
-        <w:t>¿</w:t>
-      </w:r>
-      <w:proofErr w:type="gramEnd"/>
-      <w:r>
-        <w:rPr>
-          <w:rFonts w:ascii="Arial" w:hAnsi="Arial" w:cs="Arial"/>
-          <w:sz w:val="20"/>
-          <w:szCs w:val="20"/>
-        </w:rPr>
-        <w:t>Debería el enfoque de automatización de pruebas admitir las pruebas beta?</w:t>
+        <w:t>2|</w:t>
+      </w:r>
+      <w:r>
+        <w:rPr>
+          <w:rFonts w:ascii="Arial" w:hAnsi="Arial" w:cs="Arial"/>
+          <w:sz w:val="20"/>
+          <w:szCs w:val="20"/>
+        </w:rPr>
+        <w:t>¿Debería el enfoque de automatización de pruebas admitir las pruebas beta?</w:t>
       </w:r>
     </w:p>
     <w:p>
@@ -4411,33 +4329,15 @@
           <w:sz w:val="20"/>
           <w:szCs w:val="20"/>
         </w:rPr>
-        <w:t>3</w:t>
-      </w:r>
-      <w:proofErr w:type="gramStart"/>
-      <w:r>
-        <w:rPr>
-          <w:rFonts w:ascii="Arial" w:hAnsi="Arial" w:cs="Arial"/>
-          <w:sz w:val="20"/>
-          <w:szCs w:val="20"/>
-        </w:rPr>
-        <w:t>|</w:t>
-      </w:r>
-      <w:r>
-        <w:rPr>
-          <w:rFonts w:ascii="Arial" w:hAnsi="Arial" w:cs="Arial"/>
-          <w:sz w:val="20"/>
-          <w:szCs w:val="20"/>
-        </w:rPr>
-        <w:t>¿</w:t>
-      </w:r>
-      <w:proofErr w:type="gramEnd"/>
-      <w:r>
-        <w:rPr>
-          <w:rFonts w:ascii="Arial" w:hAnsi="Arial" w:cs="Arial"/>
-          <w:sz w:val="20"/>
-          <w:szCs w:val="20"/>
-        </w:rPr>
-        <w:t>Es importante que el enfoque de automatización de pruebas admita las pruebas del software en la mayor cantidad posible de tipos de automóviles?</w:t>
+        <w:t>3|</w:t>
+      </w:r>
+      <w:r>
+        <w:rPr>
+          <w:rFonts w:ascii="Arial" w:hAnsi="Arial" w:cs="Arial"/>
+          <w:sz w:val="20"/>
+          <w:szCs w:val="20"/>
+        </w:rPr>
+        <w:t>¿Es importante que el enfoque de automatización de pruebas admita las pruebas del software en la mayor cantidad posible de tipos de automóviles?</w:t>
       </w:r>
     </w:p>
     <w:p>
@@ -4455,33 +4355,15 @@
           <w:sz w:val="20"/>
           <w:szCs w:val="20"/>
         </w:rPr>
-        <w:t>4</w:t>
-      </w:r>
-      <w:proofErr w:type="gramStart"/>
-      <w:r>
-        <w:rPr>
-          <w:rFonts w:ascii="Arial" w:hAnsi="Arial" w:cs="Arial"/>
-          <w:sz w:val="20"/>
-          <w:szCs w:val="20"/>
-        </w:rPr>
-        <w:t>|</w:t>
-      </w:r>
-      <w:r>
-        <w:rPr>
-          <w:rFonts w:ascii="Arial" w:hAnsi="Arial" w:cs="Arial"/>
-          <w:sz w:val="20"/>
-          <w:szCs w:val="20"/>
-        </w:rPr>
-        <w:t>¿</w:t>
-      </w:r>
-      <w:proofErr w:type="gramEnd"/>
-      <w:r>
-        <w:rPr>
-          <w:rFonts w:ascii="Arial" w:hAnsi="Arial" w:cs="Arial"/>
-          <w:sz w:val="20"/>
-          <w:szCs w:val="20"/>
-        </w:rPr>
-        <w:t>Qué roles de probador debería admitir el enfoque de automatización de pruebas?</w:t>
+        <w:t>4|</w:t>
+      </w:r>
+      <w:r>
+        <w:rPr>
+          <w:rFonts w:ascii="Arial" w:hAnsi="Arial" w:cs="Arial"/>
+          <w:sz w:val="20"/>
+          <w:szCs w:val="20"/>
+        </w:rPr>
+        <w:t>¿Qué roles de probador debería admitir el enfoque de automatización de pruebas?</w:t>
       </w:r>
     </w:p>
     <w:p>
@@ -4499,33 +4381,15 @@
           <w:sz w:val="20"/>
           <w:szCs w:val="20"/>
         </w:rPr>
-        <w:t>5</w:t>
-      </w:r>
-      <w:proofErr w:type="gramStart"/>
-      <w:r>
-        <w:rPr>
-          <w:rFonts w:ascii="Arial" w:hAnsi="Arial" w:cs="Arial"/>
-          <w:sz w:val="20"/>
-          <w:szCs w:val="20"/>
-        </w:rPr>
-        <w:t>|</w:t>
-      </w:r>
-      <w:r>
-        <w:rPr>
-          <w:rFonts w:ascii="Arial" w:hAnsi="Arial" w:cs="Arial"/>
-          <w:sz w:val="20"/>
-          <w:szCs w:val="20"/>
-        </w:rPr>
-        <w:t>¿</w:t>
-      </w:r>
-      <w:proofErr w:type="gramEnd"/>
-      <w:r>
-        <w:rPr>
-          <w:rFonts w:ascii="Arial" w:hAnsi="Arial" w:cs="Arial"/>
-          <w:sz w:val="20"/>
-          <w:szCs w:val="20"/>
-        </w:rPr>
-        <w:t>Es importante que el enfoque de automatización de pruebas admita la aprobación de la aplicación en la tienda de aplicaciones móviles?</w:t>
+        <w:t>5|</w:t>
+      </w:r>
+      <w:r>
+        <w:rPr>
+          <w:rFonts w:ascii="Arial" w:hAnsi="Arial" w:cs="Arial"/>
+          <w:sz w:val="20"/>
+          <w:szCs w:val="20"/>
+        </w:rPr>
+        <w:t>¿Es importante que el enfoque de automatización de pruebas admita la aprobación de la aplicación en la tienda de aplicaciones móviles?</w:t>
       </w:r>
     </w:p>
     <w:p>
@@ -6642,7 +6506,6 @@
           <w:sz w:val="20"/>
           <w:szCs w:val="20"/>
         </w:rPr>
-        <w:lastRenderedPageBreak/>
         <w:t>5|</w:t>
       </w:r>
       <w:r>
@@ -6880,6 +6743,7 @@
         </w:rPr>
       </w:pPr>
       <w:r>
+        <w:lastRenderedPageBreak/>
         <w:t>EXPLANATION:</w:t>
       </w:r>
       <w:r>
@@ -7161,7 +7025,25 @@
           <w:sz w:val="20"/>
           <w:szCs w:val="20"/>
         </w:rPr>
-        <w:t xml:space="preserve"> is </w:t>
+        <w:t xml:space="preserve"> </w:t>
+      </w:r>
+      <w:proofErr w:type="spellStart"/>
+      <w:r>
+        <w:rPr>
+          <w:rFonts w:ascii="Arial" w:hAnsi="Arial" w:cs="Arial"/>
+          <w:sz w:val="20"/>
+          <w:szCs w:val="20"/>
+        </w:rPr>
+        <w:t>is</w:t>
+      </w:r>
+      <w:proofErr w:type="spellEnd"/>
+      <w:r>
+        <w:rPr>
+          <w:rFonts w:ascii="Arial" w:hAnsi="Arial" w:cs="Arial"/>
+          <w:sz w:val="20"/>
+          <w:szCs w:val="20"/>
+        </w:rPr>
+        <w:t xml:space="preserve"> </w:t>
       </w:r>
       <w:proofErr w:type="spellStart"/>
       <w:r>

</xml_diff>

<commit_message>
nuevo json de automation question
</commit_message>
<xml_diff>
--- a/backend/json_generation/preguntas.docx
+++ b/backend/json_generation/preguntas.docx
@@ -3403,7 +3403,15 @@
           <w:sz w:val="20"/>
           <w:szCs w:val="20"/>
         </w:rPr>
-        <w:t>e) Incorrecta. Interoperabilidad también es una característica de calidad.</w:t>
+        <w:t>d</w:t>
+      </w:r>
+      <w:r>
+        <w:rPr>
+          <w:rFonts w:ascii="Arial" w:hAnsi="Arial" w:cs="Arial"/>
+          <w:sz w:val="20"/>
+          <w:szCs w:val="20"/>
+        </w:rPr>
+        <w:t>) Incorrecta. Interoperabilidad también es una característica de calidad.</w:t>
       </w:r>
     </w:p>
     <w:bookmarkEnd w:id="2"/>
@@ -3795,7 +3803,15 @@
           <w:sz w:val="20"/>
           <w:szCs w:val="20"/>
         </w:rPr>
-        <w:t>e) Is not correct. Interoperability is also a quality characteristic.</w:t>
+        <w:t>d</w:t>
+      </w:r>
+      <w:r>
+        <w:rPr>
+          <w:rFonts w:ascii="Arial" w:hAnsi="Arial" w:cs="Arial"/>
+          <w:sz w:val="20"/>
+          <w:szCs w:val="20"/>
+        </w:rPr>
+        <w:t>) Is not correct. Interoperability is also a quality characteristic.</w:t>
       </w:r>
     </w:p>
     <w:bookmarkEnd w:id="5"/>

</xml_diff>